<commit_message>
Abu Ghazi Village: 250k refinance scenarios and study addendum
Co-Authored-By: Claude Opus 5.5 (1M context) <noreply@anthropic.com>
Claude-Session: https://claude.ai/code/session_01SHa6crvVEuPcYfhvw5C66Y
</commit_message>
<xml_diff>
--- a/feasibility-study-team-of-agents/studies/abu-ghazi-village/feasibility-study.docx
+++ b/feasibility-study-team-of-agents/studies/abu-ghazi-village/feasibility-study.docx
@@ -23043,6 +23043,1388 @@
       </w:r>
     </w:p>
     <w:bookmarkEnd w:id="41"/>
+    <w:bookmarkStart w:id="46" w:name="Xb8b90ab1f50d24cae71917a042b3982c187366e"/>
+    <w:p>
+      <w:pPr>
+        <w:pStyle w:val="Heading1"/>
+        <w:bidi/>
+      </w:pPr>
+      <w:r>
+        <w:rPr>
+          <w:rtl/>
+        </w:rPr>
+        <w:t xml:space="preserve">ملحق أ: تمويل 250 ألف دينار مع إعادة تمويل القرض القائم (~140 ألف)</w:t>
+      </w:r>
+    </w:p>
+    <w:p>
+      <w:pPr>
+        <w:bidi/>
+      </w:pPr>
+      <w:r>
+        <w:rPr>
+          <w:rtl/>
+          <w:bCs/>
+          <w:b/>
+        </w:rPr>
+        <w:t xml:space="preserve">English summary.</w:t>
+      </w:r>
+      <w:r>
+        <w:rPr>
+          <w:rtl/>
+        </w:rPr>
+        <w:t xml:space="preserve"> </w:t>
+      </w:r>
+      <w:r>
+        <w:rPr>
+          <w:rtl/>
+        </w:rPr>
+        <w:t xml:space="preserve">The owner needs at least JOD 250k, because about JOD 140k of it will refinance an existing loan on the project. If that money sits in one 10-year CBJ facility at 3.25%, Year-2 DSCR falls to 1.02 [ASSUMPTION: base operations]. That is below the ~1.25 banks normally require. At CBJ terms the project carries about 205k on its own. The recommended structure is</w:t>
+      </w:r>
+      <w:r>
+        <w:rPr>
+          <w:rtl/>
+        </w:rPr>
+        <w:t xml:space="preserve"> </w:t>
+      </w:r>
+      <w:r>
+        <w:rPr>
+          <w:rtl/>
+          <w:bCs/>
+          <w:b/>
+        </w:rPr>
+        <w:t xml:space="preserve">one JOD 250k Islamic facility (diminishing musharaka or ijara), with a 15-year tenor including 12 months’ grace, at about 7%</w:t>
+      </w:r>
+      <w:r>
+        <w:rPr>
+          <w:rtl/>
+        </w:rPr>
+        <w:t xml:space="preserve"> </w:t>
+      </w:r>
+      <w:r>
+        <w:rPr>
+          <w:rtl/>
+        </w:rPr>
+        <w:t xml:space="preserve">[VERIFY: rate and tenor with Islamic banks]. That gives a monthly payment of 2,338.50, DSCR 1.24 in Year 2 rising to 1.37 by Year 10, and a lowest cash balance of 36,437. A 15-year commercial loan at 8.5% is the fallback (DSCR 1.16). Even at 250k, only about 110k is new money, against roughly 164k the project needs. The ~54k gap has to be closed by extra owner equity, a smaller programme, or by showing that the 140k already paid for part of the works.</w:t>
+      </w:r>
+    </w:p>
+    <w:bookmarkStart w:id="42" w:name="Xc4b3b3e6965935f52ef25910b0bb1df89083ba7"/>
+    <w:p>
+      <w:pPr>
+        <w:pStyle w:val="Heading2"/>
+        <w:bidi/>
+      </w:pPr>
+      <w:r>
+        <w:rPr>
+          <w:rtl/>
+        </w:rPr>
+        <w:t xml:space="preserve">أ.1 النتائج (التشغيل الأساسي، المصدر: model/agv_model.py، مجموعة REFI)</w:t>
+      </w:r>
+    </w:p>
+    <w:tbl>
+      <w:tblPr>
+        <w:tblStyle w:val="Table"/>
+        <w:tblW w:type="pct" w:w="5000"/>
+        <w:tblLook w:firstRow="1" w:lastRow="0" w:firstColumn="0" w:lastColumn="0" w:noHBand="0" w:noVBand="0" w:val="0020"/>
+        <w:jc w:val="start"/>
+      </w:tblPr>
+      <w:tblGrid>
+        <w:gridCol w:w="1033"/>
+        <w:gridCol w:w="1377"/>
+        <w:gridCol w:w="1377"/>
+        <w:gridCol w:w="1377"/>
+        <w:gridCol w:w="1377"/>
+        <w:gridCol w:w="1377"/>
+      </w:tblGrid>
+      <w:tr>
+        <w:trPr>
+          <w:tblHeader w:val="true"/>
+        </w:trPr>
+        <w:tc>
+          <w:tcPr/>
+          <w:p>
+            <w:pPr>
+              <w:pStyle w:val="Compact"/>
+              <w:bidi/>
+              <w:jc w:val="left"/>
+            </w:pPr>
+            <w:r>
+              <w:rPr>
+                <w:rtl/>
+              </w:rPr>
+              <w:t xml:space="preserve">الحالة</w:t>
+            </w:r>
+          </w:p>
+        </w:tc>
+        <w:tc>
+          <w:tcPr/>
+          <w:p>
+            <w:pPr>
+              <w:pStyle w:val="Compact"/>
+              <w:bidi/>
+              <w:jc w:val="right"/>
+            </w:pPr>
+            <w:r>
+              <w:rPr>
+                <w:rtl/>
+              </w:rPr>
+              <w:t xml:space="preserve">الدين</w:t>
+            </w:r>
+          </w:p>
+        </w:tc>
+        <w:tc>
+          <w:tcPr/>
+          <w:p>
+            <w:pPr>
+              <w:pStyle w:val="Compact"/>
+              <w:bidi/>
+              <w:jc w:val="right"/>
+            </w:pPr>
+            <w:r>
+              <w:rPr>
+                <w:rtl/>
+              </w:rPr>
+              <w:t xml:space="preserve">القسط الشهري</w:t>
+            </w:r>
+          </w:p>
+        </w:tc>
+        <w:tc>
+          <w:tcPr/>
+          <w:p>
+            <w:pPr>
+              <w:pStyle w:val="Compact"/>
+              <w:bidi/>
+              <w:jc w:val="right"/>
+            </w:pPr>
+            <w:r>
+              <w:rPr>
+                <w:rtl/>
+              </w:rPr>
+              <w:t xml:space="preserve">DSCR السنة 2</w:t>
+            </w:r>
+          </w:p>
+        </w:tc>
+        <w:tc>
+          <w:tcPr/>
+          <w:p>
+            <w:pPr>
+              <w:pStyle w:val="Compact"/>
+              <w:bidi/>
+              <w:jc w:val="right"/>
+            </w:pPr>
+            <w:r>
+              <w:rPr>
+                <w:rtl/>
+              </w:rPr>
+              <w:t xml:space="preserve">DSCR السنة 10</w:t>
+            </w:r>
+          </w:p>
+        </w:tc>
+        <w:tc>
+          <w:tcPr/>
+          <w:p>
+            <w:pPr>
+              <w:pStyle w:val="Compact"/>
+              <w:bidi/>
+              <w:jc w:val="right"/>
+            </w:pPr>
+            <w:r>
+              <w:rPr>
+                <w:rtl/>
+              </w:rPr>
+              <w:t xml:space="preserve">أدنى نقد</w:t>
+            </w:r>
+          </w:p>
+        </w:tc>
+      </w:tr>
+      <w:tr>
+        <w:tc>
+          <w:tcPr/>
+          <w:p>
+            <w:pPr>
+              <w:pStyle w:val="Compact"/>
+              <w:bidi/>
+              <w:jc w:val="left"/>
+            </w:pPr>
+            <w:r>
+              <w:rPr>
+                <w:rtl/>
+              </w:rPr>
+              <w:t xml:space="preserve">R1 ‏250 ألف، برنامج البنك المركزي 3.25%، 10 سنوات</w:t>
+            </w:r>
+          </w:p>
+        </w:tc>
+        <w:tc>
+          <w:tcPr/>
+          <w:p>
+            <w:pPr>
+              <w:pStyle w:val="Compact"/>
+              <w:bidi/>
+              <w:jc w:val="right"/>
+            </w:pPr>
+            <w:r>
+              <w:rPr>
+                <w:rtl/>
+              </w:rPr>
+              <w:t xml:space="preserve">250,000</w:t>
+            </w:r>
+          </w:p>
+        </w:tc>
+        <w:tc>
+          <w:tcPr/>
+          <w:p>
+            <w:pPr>
+              <w:pStyle w:val="Compact"/>
+              <w:bidi/>
+              <w:jc w:val="right"/>
+            </w:pPr>
+            <w:r>
+              <w:rPr>
+                <w:rtl/>
+              </w:rPr>
+              <w:t xml:space="preserve">2,672.95</w:t>
+            </w:r>
+          </w:p>
+        </w:tc>
+        <w:tc>
+          <w:tcPr/>
+          <w:p>
+            <w:pPr>
+              <w:pStyle w:val="Compact"/>
+              <w:bidi/>
+              <w:jc w:val="right"/>
+            </w:pPr>
+            <w:r>
+              <w:rPr>
+                <w:rtl/>
+              </w:rPr>
+              <w:t xml:space="preserve">1.02</w:t>
+            </w:r>
+          </w:p>
+        </w:tc>
+        <w:tc>
+          <w:tcPr/>
+          <w:p>
+            <w:pPr>
+              <w:pStyle w:val="Compact"/>
+              <w:bidi/>
+              <w:jc w:val="right"/>
+            </w:pPr>
+            <w:r>
+              <w:rPr>
+                <w:rtl/>
+              </w:rPr>
+              <w:t xml:space="preserve">1.14</w:t>
+            </w:r>
+          </w:p>
+        </w:tc>
+        <w:tc>
+          <w:tcPr/>
+          <w:p>
+            <w:pPr>
+              <w:pStyle w:val="Compact"/>
+              <w:bidi/>
+              <w:jc w:val="right"/>
+            </w:pPr>
+            <w:r>
+              <w:rPr>
+                <w:rtl/>
+              </w:rPr>
+              <w:t xml:space="preserve">43,937</w:t>
+            </w:r>
+          </w:p>
+        </w:tc>
+      </w:tr>
+      <w:tr>
+        <w:tc>
+          <w:tcPr/>
+          <w:p>
+            <w:pPr>
+              <w:pStyle w:val="Compact"/>
+              <w:bidi/>
+              <w:jc w:val="left"/>
+            </w:pPr>
+            <w:r>
+              <w:rPr>
+                <w:rtl/>
+              </w:rPr>
+              <w:t xml:space="preserve">R2 ‏305 آلاف (140 إعادة تمويل + 165 جديد)، البنك المركزي</w:t>
+            </w:r>
+          </w:p>
+        </w:tc>
+        <w:tc>
+          <w:tcPr/>
+          <w:p>
+            <w:pPr>
+              <w:pStyle w:val="Compact"/>
+              <w:bidi/>
+              <w:jc w:val="right"/>
+            </w:pPr>
+            <w:r>
+              <w:rPr>
+                <w:rtl/>
+              </w:rPr>
+              <w:t xml:space="preserve">305,000</w:t>
+            </w:r>
+          </w:p>
+        </w:tc>
+        <w:tc>
+          <w:tcPr/>
+          <w:p>
+            <w:pPr>
+              <w:pStyle w:val="Compact"/>
+              <w:bidi/>
+              <w:jc w:val="right"/>
+            </w:pPr>
+            <w:r>
+              <w:rPr>
+                <w:rtl/>
+              </w:rPr>
+              <w:t xml:space="preserve">3,261.00</w:t>
+            </w:r>
+          </w:p>
+        </w:tc>
+        <w:tc>
+          <w:tcPr/>
+          <w:p>
+            <w:pPr>
+              <w:pStyle w:val="Compact"/>
+              <w:bidi/>
+              <w:jc w:val="right"/>
+            </w:pPr>
+            <w:r>
+              <w:rPr>
+                <w:rtl/>
+              </w:rPr>
+              <w:t xml:space="preserve">0.85</w:t>
+            </w:r>
+          </w:p>
+        </w:tc>
+        <w:tc>
+          <w:tcPr/>
+          <w:p>
+            <w:pPr>
+              <w:pStyle w:val="Compact"/>
+              <w:bidi/>
+              <w:jc w:val="right"/>
+            </w:pPr>
+            <w:r>
+              <w:rPr>
+                <w:rtl/>
+              </w:rPr>
+              <w:t xml:space="preserve">0.94</w:t>
+            </w:r>
+          </w:p>
+        </w:tc>
+        <w:tc>
+          <w:tcPr/>
+          <w:p>
+            <w:pPr>
+              <w:pStyle w:val="Compact"/>
+              <w:bidi/>
+              <w:jc w:val="right"/>
+            </w:pPr>
+            <w:r>
+              <w:rPr>
+                <w:rtl/>
+              </w:rPr>
+              <w:t xml:space="preserve">7,096</w:t>
+            </w:r>
+          </w:p>
+        </w:tc>
+      </w:tr>
+      <w:tr>
+        <w:tc>
+          <w:tcPr/>
+          <w:p>
+            <w:pPr>
+              <w:pStyle w:val="Compact"/>
+              <w:bidi/>
+              <w:jc w:val="left"/>
+            </w:pPr>
+            <w:r>
+              <w:rPr>
+                <w:rtl/>
+              </w:rPr>
+              <w:t xml:space="preserve">R3 ‏110 آلاف من البنك المركزي + 140 ألف تجاري 8.5% لمدة 10 سنوات</w:t>
+            </w:r>
+          </w:p>
+        </w:tc>
+        <w:tc>
+          <w:tcPr/>
+          <w:p>
+            <w:pPr>
+              <w:pStyle w:val="Compact"/>
+              <w:bidi/>
+              <w:jc w:val="right"/>
+            </w:pPr>
+            <w:r>
+              <w:rPr>
+                <w:rtl/>
+              </w:rPr>
+              <w:t xml:space="preserve">250,000</w:t>
+            </w:r>
+          </w:p>
+        </w:tc>
+        <w:tc>
+          <w:tcPr/>
+          <w:p>
+            <w:pPr>
+              <w:pStyle w:val="Compact"/>
+              <w:bidi/>
+              <w:jc w:val="right"/>
+            </w:pPr>
+            <w:r>
+              <w:rPr>
+                <w:rtl/>
+              </w:rPr>
+              <w:t xml:space="preserve">3,035.21</w:t>
+            </w:r>
+          </w:p>
+        </w:tc>
+        <w:tc>
+          <w:tcPr/>
+          <w:p>
+            <w:pPr>
+              <w:pStyle w:val="Compact"/>
+              <w:bidi/>
+              <w:jc w:val="right"/>
+            </w:pPr>
+            <w:r>
+              <w:rPr>
+                <w:rtl/>
+              </w:rPr>
+              <w:t xml:space="preserve">0.94</w:t>
+            </w:r>
+          </w:p>
+        </w:tc>
+        <w:tc>
+          <w:tcPr/>
+          <w:p>
+            <w:pPr>
+              <w:pStyle w:val="Compact"/>
+              <w:bidi/>
+              <w:jc w:val="right"/>
+            </w:pPr>
+            <w:r>
+              <w:rPr>
+                <w:rtl/>
+              </w:rPr>
+              <w:t xml:space="preserve">1.01</w:t>
+            </w:r>
+          </w:p>
+        </w:tc>
+        <w:tc>
+          <w:tcPr/>
+          <w:p>
+            <w:pPr>
+              <w:pStyle w:val="Compact"/>
+              <w:bidi/>
+              <w:jc w:val="right"/>
+            </w:pPr>
+            <w:r>
+              <w:rPr>
+                <w:rtl/>
+              </w:rPr>
+              <w:t xml:space="preserve">32,596</w:t>
+            </w:r>
+          </w:p>
+        </w:tc>
+      </w:tr>
+      <w:tr>
+        <w:tc>
+          <w:tcPr/>
+          <w:p>
+            <w:pPr>
+              <w:pStyle w:val="Compact"/>
+              <w:bidi/>
+              <w:jc w:val="left"/>
+            </w:pPr>
+            <w:r>
+              <w:rPr>
+                <w:rtl/>
+              </w:rPr>
+              <w:t xml:space="preserve">R4 ‏110 آلاف من البنك المركزي + 140 ألف إسلامي 7% لمدة 15 سنة</w:t>
+            </w:r>
+          </w:p>
+        </w:tc>
+        <w:tc>
+          <w:tcPr/>
+          <w:p>
+            <w:pPr>
+              <w:pStyle w:val="Compact"/>
+              <w:bidi/>
+              <w:jc w:val="right"/>
+            </w:pPr>
+            <w:r>
+              <w:rPr>
+                <w:rtl/>
+              </w:rPr>
+              <w:t xml:space="preserve">250,000</w:t>
+            </w:r>
+          </w:p>
+        </w:tc>
+        <w:tc>
+          <w:tcPr/>
+          <w:p>
+            <w:pPr>
+              <w:pStyle w:val="Compact"/>
+              <w:bidi/>
+              <w:jc w:val="right"/>
+            </w:pPr>
+            <w:r>
+              <w:rPr>
+                <w:rtl/>
+              </w:rPr>
+              <w:t xml:space="preserve">2,485.66</w:t>
+            </w:r>
+          </w:p>
+        </w:tc>
+        <w:tc>
+          <w:tcPr/>
+          <w:p>
+            <w:pPr>
+              <w:pStyle w:val="Compact"/>
+              <w:bidi/>
+              <w:jc w:val="right"/>
+            </w:pPr>
+            <w:r>
+              <w:rPr>
+                <w:rtl/>
+              </w:rPr>
+              <w:t xml:space="preserve">1.14</w:t>
+            </w:r>
+          </w:p>
+        </w:tc>
+        <w:tc>
+          <w:tcPr/>
+          <w:p>
+            <w:pPr>
+              <w:pStyle w:val="Compact"/>
+              <w:bidi/>
+              <w:jc w:val="right"/>
+            </w:pPr>
+            <w:r>
+              <w:rPr>
+                <w:rtl/>
+              </w:rPr>
+              <w:t xml:space="preserve">1.26</w:t>
+            </w:r>
+          </w:p>
+        </w:tc>
+        <w:tc>
+          <w:tcPr/>
+          <w:p>
+            <w:pPr>
+              <w:pStyle w:val="Compact"/>
+              <w:bidi/>
+              <w:jc w:val="right"/>
+            </w:pPr>
+            <w:r>
+              <w:rPr>
+                <w:rtl/>
+              </w:rPr>
+              <w:t xml:space="preserve">39,737</w:t>
+            </w:r>
+          </w:p>
+        </w:tc>
+      </w:tr>
+      <w:tr>
+        <w:tc>
+          <w:tcPr/>
+          <w:p>
+            <w:pPr>
+              <w:pStyle w:val="Compact"/>
+              <w:bidi/>
+              <w:jc w:val="left"/>
+            </w:pPr>
+            <w:r>
+              <w:rPr>
+                <w:rtl/>
+                <w:bCs/>
+                <w:b/>
+              </w:rPr>
+              <w:t xml:space="preserve">R5 ‏250 ألف إسلامي 7%، 15 سنة (12 شهر سماح + 168 قسطاً) – موصى به</w:t>
+            </w:r>
+          </w:p>
+        </w:tc>
+        <w:tc>
+          <w:tcPr/>
+          <w:p>
+            <w:pPr>
+              <w:pStyle w:val="Compact"/>
+              <w:bidi/>
+              <w:jc w:val="right"/>
+            </w:pPr>
+            <w:r>
+              <w:rPr>
+                <w:rtl/>
+              </w:rPr>
+              <w:t xml:space="preserve">250,000</w:t>
+            </w:r>
+          </w:p>
+        </w:tc>
+        <w:tc>
+          <w:tcPr/>
+          <w:p>
+            <w:pPr>
+              <w:pStyle w:val="Compact"/>
+              <w:bidi/>
+              <w:jc w:val="right"/>
+            </w:pPr>
+            <w:r>
+              <w:rPr>
+                <w:rtl/>
+                <w:bCs/>
+                <w:b/>
+              </w:rPr>
+              <w:t xml:space="preserve">2,338.50</w:t>
+            </w:r>
+          </w:p>
+        </w:tc>
+        <w:tc>
+          <w:tcPr/>
+          <w:p>
+            <w:pPr>
+              <w:pStyle w:val="Compact"/>
+              <w:bidi/>
+              <w:jc w:val="right"/>
+            </w:pPr>
+            <w:r>
+              <w:rPr>
+                <w:rtl/>
+                <w:bCs/>
+                <w:b/>
+              </w:rPr>
+              <w:t xml:space="preserve">1.24</w:t>
+            </w:r>
+          </w:p>
+        </w:tc>
+        <w:tc>
+          <w:tcPr/>
+          <w:p>
+            <w:pPr>
+              <w:pStyle w:val="Compact"/>
+              <w:bidi/>
+              <w:jc w:val="right"/>
+            </w:pPr>
+            <w:r>
+              <w:rPr>
+                <w:rtl/>
+                <w:bCs/>
+                <w:b/>
+              </w:rPr>
+              <w:t xml:space="preserve">1.37</w:t>
+            </w:r>
+          </w:p>
+        </w:tc>
+        <w:tc>
+          <w:tcPr/>
+          <w:p>
+            <w:pPr>
+              <w:pStyle w:val="Compact"/>
+              <w:bidi/>
+              <w:jc w:val="right"/>
+            </w:pPr>
+            <w:r>
+              <w:rPr>
+                <w:rtl/>
+              </w:rPr>
+              <w:t xml:space="preserve">36,437</w:t>
+            </w:r>
+          </w:p>
+        </w:tc>
+      </w:tr>
+      <w:tr>
+        <w:tc>
+          <w:tcPr/>
+          <w:p>
+            <w:pPr>
+              <w:pStyle w:val="Compact"/>
+              <w:bidi/>
+              <w:jc w:val="left"/>
+            </w:pPr>
+            <w:r>
+              <w:rPr>
+                <w:rtl/>
+              </w:rPr>
+              <w:t xml:space="preserve">R5 مع انخفاض الإيرادات 10%</w:t>
+            </w:r>
+          </w:p>
+        </w:tc>
+        <w:tc>
+          <w:tcPr/>
+          <w:p>
+            <w:pPr>
+              <w:pStyle w:val="Compact"/>
+              <w:bidi/>
+              <w:jc w:val="right"/>
+            </w:pPr>
+            <w:r>
+              <w:rPr>
+                <w:rtl/>
+              </w:rPr>
+              <w:t xml:space="preserve">250,000</w:t>
+            </w:r>
+          </w:p>
+        </w:tc>
+        <w:tc>
+          <w:tcPr/>
+          <w:p>
+            <w:pPr>
+              <w:pStyle w:val="Compact"/>
+              <w:bidi/>
+              <w:jc w:val="right"/>
+            </w:pPr>
+            <w:r>
+              <w:rPr>
+                <w:rtl/>
+              </w:rPr>
+              <w:t xml:space="preserve">2,338.50</w:t>
+            </w:r>
+          </w:p>
+        </w:tc>
+        <w:tc>
+          <w:tcPr/>
+          <w:p>
+            <w:pPr>
+              <w:pStyle w:val="Compact"/>
+              <w:bidi/>
+              <w:jc w:val="right"/>
+            </w:pPr>
+            <w:r>
+              <w:rPr>
+                <w:rtl/>
+              </w:rPr>
+              <w:t xml:space="preserve">1.01</w:t>
+            </w:r>
+          </w:p>
+        </w:tc>
+        <w:tc>
+          <w:tcPr/>
+          <w:p>
+            <w:pPr>
+              <w:pStyle w:val="Compact"/>
+              <w:bidi/>
+              <w:jc w:val="right"/>
+            </w:pPr>
+            <w:r>
+              <w:rPr>
+                <w:rtl/>
+              </w:rPr>
+              <w:t xml:space="preserve">1.06</w:t>
+            </w:r>
+          </w:p>
+        </w:tc>
+        <w:tc>
+          <w:tcPr/>
+          <w:p>
+            <w:pPr>
+              <w:pStyle w:val="Compact"/>
+              <w:bidi/>
+              <w:jc w:val="right"/>
+            </w:pPr>
+            <w:r>
+              <w:rPr>
+                <w:rtl/>
+              </w:rPr>
+              <w:t xml:space="preserve">29,550</w:t>
+            </w:r>
+          </w:p>
+        </w:tc>
+      </w:tr>
+      <w:tr>
+        <w:tc>
+          <w:tcPr/>
+          <w:p>
+            <w:pPr>
+              <w:pStyle w:val="Compact"/>
+              <w:bidi/>
+              <w:jc w:val="left"/>
+            </w:pPr>
+            <w:r>
+              <w:rPr>
+                <w:rtl/>
+              </w:rPr>
+              <w:t xml:space="preserve">R6 ‏250 ألف تجاري 8.5%، 15 سنة</w:t>
+            </w:r>
+          </w:p>
+        </w:tc>
+        <w:tc>
+          <w:tcPr/>
+          <w:p>
+            <w:pPr>
+              <w:pStyle w:val="Compact"/>
+              <w:bidi/>
+              <w:jc w:val="right"/>
+            </w:pPr>
+            <w:r>
+              <w:rPr>
+                <w:rtl/>
+              </w:rPr>
+              <w:t xml:space="preserve">250,000</w:t>
+            </w:r>
+          </w:p>
+        </w:tc>
+        <w:tc>
+          <w:tcPr/>
+          <w:p>
+            <w:pPr>
+              <w:pStyle w:val="Compact"/>
+              <w:bidi/>
+              <w:jc w:val="right"/>
+            </w:pPr>
+            <w:r>
+              <w:rPr>
+                <w:rtl/>
+              </w:rPr>
+              <w:t xml:space="preserve">2,549.80</w:t>
+            </w:r>
+          </w:p>
+        </w:tc>
+        <w:tc>
+          <w:tcPr/>
+          <w:p>
+            <w:pPr>
+              <w:pStyle w:val="Compact"/>
+              <w:bidi/>
+              <w:jc w:val="right"/>
+            </w:pPr>
+            <w:r>
+              <w:rPr>
+                <w:rtl/>
+              </w:rPr>
+              <w:t xml:space="preserve">1.16</w:t>
+            </w:r>
+          </w:p>
+        </w:tc>
+        <w:tc>
+          <w:tcPr/>
+          <w:p>
+            <w:pPr>
+              <w:pStyle w:val="Compact"/>
+              <w:bidi/>
+              <w:jc w:val="right"/>
+            </w:pPr>
+            <w:r>
+              <w:rPr>
+                <w:rtl/>
+              </w:rPr>
+              <w:t xml:space="preserve">1.27</w:t>
+            </w:r>
+          </w:p>
+        </w:tc>
+        <w:tc>
+          <w:tcPr/>
+          <w:p>
+            <w:pPr>
+              <w:pStyle w:val="Compact"/>
+              <w:bidi/>
+              <w:jc w:val="right"/>
+            </w:pPr>
+            <w:r>
+              <w:rPr>
+                <w:rtl/>
+              </w:rPr>
+              <w:t xml:space="preserve">33,437</w:t>
+            </w:r>
+          </w:p>
+        </w:tc>
+      </w:tr>
+      <w:tr>
+        <w:tc>
+          <w:tcPr/>
+          <w:p>
+            <w:pPr>
+              <w:pStyle w:val="Compact"/>
+              <w:bidi/>
+              <w:jc w:val="left"/>
+            </w:pPr>
+            <w:r>
+              <w:rPr>
+                <w:rtl/>
+              </w:rPr>
+              <w:t xml:space="preserve">R7 ‏305 آلاف: 165 من البنك المركزي + 140 إسلامي</w:t>
+            </w:r>
+          </w:p>
+        </w:tc>
+        <w:tc>
+          <w:tcPr/>
+          <w:p>
+            <w:pPr>
+              <w:pStyle w:val="Compact"/>
+              <w:bidi/>
+              <w:jc w:val="right"/>
+            </w:pPr>
+            <w:r>
+              <w:rPr>
+                <w:rtl/>
+              </w:rPr>
+              <w:t xml:space="preserve">305,000</w:t>
+            </w:r>
+          </w:p>
+        </w:tc>
+        <w:tc>
+          <w:tcPr/>
+          <w:p>
+            <w:pPr>
+              <w:pStyle w:val="Compact"/>
+              <w:bidi/>
+              <w:jc w:val="right"/>
+            </w:pPr>
+            <w:r>
+              <w:rPr>
+                <w:rtl/>
+              </w:rPr>
+              <w:t xml:space="preserve">3,073.71</w:t>
+            </w:r>
+          </w:p>
+        </w:tc>
+        <w:tc>
+          <w:tcPr/>
+          <w:p>
+            <w:pPr>
+              <w:pStyle w:val="Compact"/>
+              <w:bidi/>
+              <w:jc w:val="right"/>
+            </w:pPr>
+            <w:r>
+              <w:rPr>
+                <w:rtl/>
+              </w:rPr>
+              <w:t xml:space="preserve">0.93</w:t>
+            </w:r>
+          </w:p>
+        </w:tc>
+        <w:tc>
+          <w:tcPr/>
+          <w:p>
+            <w:pPr>
+              <w:pStyle w:val="Compact"/>
+              <w:bidi/>
+              <w:jc w:val="right"/>
+            </w:pPr>
+            <w:r>
+              <w:rPr>
+                <w:rtl/>
+              </w:rPr>
+              <w:t xml:space="preserve">1.02</w:t>
+            </w:r>
+          </w:p>
+        </w:tc>
+        <w:tc>
+          <w:tcPr/>
+          <w:p>
+            <w:pPr>
+              <w:pStyle w:val="Compact"/>
+              <w:bidi/>
+              <w:jc w:val="right"/>
+            </w:pPr>
+            <w:r>
+              <w:rPr>
+                <w:rtl/>
+              </w:rPr>
+              <w:t xml:space="preserve">31,089</w:t>
+            </w:r>
+          </w:p>
+        </w:tc>
+      </w:tr>
+      <w:tr>
+        <w:tc>
+          <w:tcPr/>
+          <w:p>
+            <w:pPr>
+              <w:pStyle w:val="Compact"/>
+              <w:bidi/>
+              <w:jc w:val="left"/>
+            </w:pPr>
+            <w:r>
+              <w:rPr>
+                <w:rtl/>
+              </w:rPr>
+              <w:t xml:space="preserve">السقف: 205 آلاف من البنك المركزي 3.25%، 10 سنوات</w:t>
+            </w:r>
+          </w:p>
+        </w:tc>
+        <w:tc>
+          <w:tcPr/>
+          <w:p>
+            <w:pPr>
+              <w:pStyle w:val="Compact"/>
+              <w:bidi/>
+              <w:jc w:val="right"/>
+            </w:pPr>
+            <w:r>
+              <w:rPr>
+                <w:rtl/>
+              </w:rPr>
+              <w:t xml:space="preserve">205,000</w:t>
+            </w:r>
+          </w:p>
+        </w:tc>
+        <w:tc>
+          <w:tcPr/>
+          <w:p>
+            <w:pPr>
+              <w:pStyle w:val="Compact"/>
+              <w:bidi/>
+              <w:jc w:val="right"/>
+            </w:pPr>
+            <w:r>
+              <w:rPr>
+                <w:rtl/>
+              </w:rPr>
+              <w:t xml:space="preserve">2,191.82</w:t>
+            </w:r>
+          </w:p>
+        </w:tc>
+        <w:tc>
+          <w:tcPr/>
+          <w:p>
+            <w:pPr>
+              <w:pStyle w:val="Compact"/>
+              <w:bidi/>
+              <w:jc w:val="right"/>
+            </w:pPr>
+            <w:r>
+              <w:rPr>
+                <w:rtl/>
+              </w:rPr>
+              <w:t xml:space="preserve">1.24</w:t>
+            </w:r>
+          </w:p>
+        </w:tc>
+        <w:tc>
+          <w:tcPr/>
+          <w:p>
+            <w:pPr>
+              <w:pStyle w:val="Compact"/>
+              <w:bidi/>
+              <w:jc w:val="right"/>
+            </w:pPr>
+            <w:r>
+              <w:rPr>
+                <w:rtl/>
+              </w:rPr>
+              <w:t xml:space="preserve">1.39</w:t>
+            </w:r>
+          </w:p>
+        </w:tc>
+        <w:tc>
+          <w:tcPr/>
+          <w:p>
+            <w:pPr>
+              <w:pStyle w:val="Compact"/>
+              <w:bidi/>
+              <w:jc w:val="right"/>
+            </w:pPr>
+            <w:r>
+              <w:rPr>
+                <w:rtl/>
+              </w:rPr>
+              <w:t xml:space="preserve">45,107</w:t>
+            </w:r>
+          </w:p>
+        </w:tc>
+      </w:tr>
+    </w:tbl>
+    <w:p>
+      <w:pPr>
+        <w:bidi/>
+      </w:pPr>
+      <w:r>
+        <w:rPr>
+          <w:rtl/>
+        </w:rPr>
+        <w:t xml:space="preserve">طريقة الحساب: القسط = P·r/(1−(1+r)^−n). في R5 تكون r = 7%/12 وn = 168، وفترة السماح 12 شهراً يُدفع خلالها الربح فقط. DSCR = (EBITDA − الضريبة) ÷ خدمة الدين السنوية.</w:t>
+      </w:r>
+    </w:p>
+    <w:bookmarkEnd w:id="42"/>
+    <w:bookmarkStart w:id="43" w:name="أ.2-لماذا-التمويل-الإسلامي-لمدة-15-سنة"/>
+    <w:p>
+      <w:pPr>
+        <w:pStyle w:val="Heading2"/>
+        <w:bidi/>
+      </w:pPr>
+      <w:r>
+        <w:rPr>
+          <w:rtl/>
+        </w:rPr>
+        <w:t xml:space="preserve">أ.2 لماذا التمويل الإسلامي لمدة 15 سنة</w:t>
+      </w:r>
+    </w:p>
+    <w:p>
+      <w:pPr>
+        <w:numPr>
+          <w:ilvl w:val="0"/>
+          <w:numId w:val="1035"/>
+        </w:numPr>
+        <w:pStyle w:val="Compact"/>
+        <w:bidi/>
+      </w:pPr>
+      <w:r>
+        <w:rPr>
+          <w:rtl/>
+          <w:bCs/>
+          <w:b/>
+        </w:rPr>
+        <w:t xml:space="preserve">البنك المركزي:</w:t>
+      </w:r>
+      <w:r>
+        <w:rPr>
+          <w:rtl/>
+        </w:rPr>
+        <w:t xml:space="preserve"> </w:t>
+      </w:r>
+      <w:r>
+        <w:rPr>
+          <w:rtl/>
+        </w:rPr>
+        <w:t xml:space="preserve">سقف المدة في برنامج القطاعات الاقتصادية 10 سنوات شاملة السماح [SOURCE: صفحة بنك الإسكان، 15/10/2026]. بهذه المدة لا يحتمل المشروع أكثر من نحو 205 آلاف بتغطية 1.25. أما استخدام البرنامج لإعادة تمويل دين قائم فغير مؤكد [VERIFY].</w:t>
+      </w:r>
+    </w:p>
+    <w:p>
+      <w:pPr>
+        <w:numPr>
+          <w:ilvl w:val="0"/>
+          <w:numId w:val="1035"/>
+        </w:numPr>
+        <w:pStyle w:val="Compact"/>
+        <w:bidi/>
+      </w:pPr>
+      <w:r>
+        <w:rPr>
+          <w:rtl/>
+          <w:bCs/>
+          <w:b/>
+        </w:rPr>
+        <w:t xml:space="preserve">الإجارة والمشاركة المتناقصة:</w:t>
+      </w:r>
+      <w:r>
+        <w:rPr>
+          <w:rtl/>
+        </w:rPr>
+        <w:t xml:space="preserve"> </w:t>
+      </w:r>
+      <w:r>
+        <w:rPr>
+          <w:rtl/>
+        </w:rPr>
+        <w:t xml:space="preserve">صيغتان شائعتان لتمويل العقار السياحي، والمدة الأطول تخفض القسط. هامش الربح 7% [ASSUMPTION] ويجب الحصول على عروض فعلية.</w:t>
+      </w:r>
+    </w:p>
+    <w:p>
+      <w:pPr>
+        <w:numPr>
+          <w:ilvl w:val="0"/>
+          <w:numId w:val="1035"/>
+        </w:numPr>
+        <w:pStyle w:val="Compact"/>
+        <w:bidi/>
+      </w:pPr>
+      <w:r>
+        <w:rPr>
+          <w:rtl/>
+          <w:bCs/>
+          <w:b/>
+        </w:rPr>
+        <w:t xml:space="preserve">ضمان الشركة الأردنية لضمان القروض:</w:t>
+      </w:r>
+      <w:r>
+        <w:rPr>
+          <w:rtl/>
+        </w:rPr>
+        <w:t xml:space="preserve"> </w:t>
+      </w:r>
+      <w:r>
+        <w:rPr>
+          <w:rtl/>
+        </w:rPr>
+        <w:t xml:space="preserve">سقف المدة في برنامج الشركات الصغيرة والمتوسطة 72 شهراً، وفي برنامج كفالة الإسلامي 96 شهراً، وكلاهما أقل من 15 سنة. لذلك الضمان الرئيسي هو رهن العقار، ويمكن إضافة كفالة جزئية على الشريحة الأولى إن قبل البنك.</w:t>
+      </w:r>
+    </w:p>
+    <w:p>
+      <w:pPr>
+        <w:numPr>
+          <w:ilvl w:val="0"/>
+          <w:numId w:val="1035"/>
+        </w:numPr>
+        <w:pStyle w:val="Compact"/>
+        <w:bidi/>
+      </w:pPr>
+      <w:r>
+        <w:rPr>
+          <w:rtl/>
+          <w:bCs/>
+          <w:b/>
+        </w:rPr>
+        <w:t xml:space="preserve">الرهن من الدرجة الأولى:</w:t>
+      </w:r>
+      <w:r>
+        <w:rPr>
+          <w:rtl/>
+        </w:rPr>
+        <w:t xml:space="preserve"> </w:t>
+      </w:r>
+      <w:r>
+        <w:rPr>
+          <w:rtl/>
+        </w:rPr>
+        <w:t xml:space="preserve">إذا كان القرض القائم مرهوناً على العقار نفسه، فلن يقرض أي ممول جديد دون فك الرهن. لذلك يجب أن تسدد الشريحة الأولى القرض القائم مباشرة.</w:t>
+      </w:r>
+    </w:p>
+    <w:bookmarkEnd w:id="43"/>
+    <w:bookmarkStart w:id="44" w:name="أ.3-الفجوة-في-الأموال-الجديدة"/>
+    <w:p>
+      <w:pPr>
+        <w:pStyle w:val="Heading2"/>
+        <w:bidi/>
+      </w:pPr>
+      <w:r>
+        <w:rPr>
+          <w:rtl/>
+        </w:rPr>
+        <w:t xml:space="preserve">أ.3 الفجوة في الأموال الجديدة</w:t>
+      </w:r>
+    </w:p>
+    <w:p>
+      <w:pPr>
+        <w:bidi/>
+      </w:pPr>
+      <w:r>
+        <w:rPr>
+          <w:rtl/>
+        </w:rPr>
+        <w:t xml:space="preserve">تحتاج الاستخدامات إلى نحو 164 ألفاً من الأموال الجديدة: كلفة الأعمال 151,682، والاحتياطي 7,584، ورأس المال العامل والاحتياطيات، يُطرح منها 20,000 مساهمة المالك [SOURCE: الفصل 8]. في المقابل لا يبقى من الـ250 ألفاً بعد إعادة التمويل سوى 110 آلاف، فتبقى فجوة تقارب 54 ألفاً. خيارات سدّها:</w:t>
+      </w:r>
+      <w:r>
+        <w:rPr>
+          <w:rtl/>
+        </w:rPr>
+        <w:t xml:space="preserve"> </w:t>
+      </w:r>
+      <w:r>
+        <w:rPr>
+          <w:rtl/>
+        </w:rPr>
+        <w:t xml:space="preserve">1. أن يثبت المالك بالفواتير أن القرض القائم موّل جزءاً من الأعمال، فتنخفض الكلفة المتبقية.</w:t>
+      </w:r>
+      <w:r>
+        <w:rPr>
+          <w:rtl/>
+        </w:rPr>
+        <w:t xml:space="preserve"> </w:t>
+      </w:r>
+      <w:r>
+        <w:rPr>
+          <w:rtl/>
+        </w:rPr>
+        <w:t xml:space="preserve">2. مساهمة إضافية من المالك.</w:t>
+      </w:r>
+      <w:r>
+        <w:rPr>
+          <w:rtl/>
+        </w:rPr>
+        <w:t xml:space="preserve"> </w:t>
+      </w:r>
+      <w:r>
+        <w:rPr>
+          <w:rtl/>
+        </w:rPr>
+        <w:t xml:space="preserve">3. تأجيل بنود غير حرجة.</w:t>
+      </w:r>
+      <w:r>
+        <w:rPr>
+          <w:rtl/>
+        </w:rPr>
+        <w:t xml:space="preserve"> </w:t>
+      </w:r>
+      <w:r>
+        <w:rPr>
+          <w:rtl/>
+        </w:rPr>
+        <w:t xml:space="preserve">4. رفع التمويل إلى نحو 305 آلاف. هذا الخيار لا يحتمله المشروع وحده (R7: DSCR 0.93)، ولا يصلح إلا إذا قبل البنك احتساب دخل المالك الآخر في التغطية الإجمالية.</w:t>
+      </w:r>
+    </w:p>
+    <w:bookmarkEnd w:id="44"/>
+    <w:bookmarkStart w:id="45" w:name="أ.4-أسئلة-للمالك-عن-القرض-القائم"/>
+    <w:p>
+      <w:pPr>
+        <w:pStyle w:val="Heading2"/>
+        <w:bidi/>
+      </w:pPr>
+      <w:r>
+        <w:rPr>
+          <w:rtl/>
+        </w:rPr>
+        <w:t xml:space="preserve">أ.4 أسئلة للمالك عن القرض القائم</w:t>
+      </w:r>
+    </w:p>
+    <w:p>
+      <w:pPr>
+        <w:numPr>
+          <w:ilvl w:val="0"/>
+          <w:numId w:val="1036"/>
+        </w:numPr>
+        <w:pStyle w:val="Compact"/>
+        <w:bidi/>
+      </w:pPr>
+      <w:r>
+        <w:rPr>
+          <w:rtl/>
+        </w:rPr>
+        <w:t xml:space="preserve">ما الجهة المقرضة، وما سعر الفائدة والمدة المتبقية والقسط الشهري؟</w:t>
+      </w:r>
+    </w:p>
+    <w:p>
+      <w:pPr>
+        <w:numPr>
+          <w:ilvl w:val="0"/>
+          <w:numId w:val="1036"/>
+        </w:numPr>
+        <w:pStyle w:val="Compact"/>
+        <w:bidi/>
+      </w:pPr>
+      <w:r>
+        <w:rPr>
+          <w:rtl/>
+        </w:rPr>
+        <w:t xml:space="preserve">هل القرض مرهون على العقار نفسه؟</w:t>
+      </w:r>
+    </w:p>
+    <w:p>
+      <w:pPr>
+        <w:numPr>
+          <w:ilvl w:val="0"/>
+          <w:numId w:val="1036"/>
+        </w:numPr>
+        <w:pStyle w:val="Compact"/>
+        <w:bidi/>
+      </w:pPr>
+      <w:r>
+        <w:rPr>
+          <w:rtl/>
+        </w:rPr>
+        <w:t xml:space="preserve">هل موّل جزءاً من الأعمال المدرجة في جدول الكميات؟ وما المبلغ؟</w:t>
+      </w:r>
+    </w:p>
+    <w:p>
+      <w:pPr>
+        <w:numPr>
+          <w:ilvl w:val="0"/>
+          <w:numId w:val="1036"/>
+        </w:numPr>
+        <w:pStyle w:val="Compact"/>
+        <w:bidi/>
+      </w:pPr>
+      <w:r>
+        <w:rPr>
+          <w:rtl/>
+        </w:rPr>
+        <w:t xml:space="preserve">هل يستطيع المالك إضافة مساهمة نقدية؟ وما مصادر دخله الأخرى التي يمكن أن يعتمد عليها البنك؟</w:t>
+      </w:r>
+    </w:p>
+    <w:bookmarkEnd w:id="45"/>
+    <w:bookmarkEnd w:id="46"/>
     <w:sectPr/>
   </w:body>
 </w:document>
@@ -23629,6 +25011,39 @@
     </w:lvlOverride>
   </w:num>
   <w:num w:numId="1034">
+    <w:abstractNumId w:val="99411"/>
+    <w:lvlOverride w:ilvl="0">
+      <w:startOverride w:val="1"/>
+    </w:lvlOverride>
+    <w:lvlOverride w:ilvl="1">
+      <w:startOverride w:val="1"/>
+    </w:lvlOverride>
+    <w:lvlOverride w:ilvl="2">
+      <w:startOverride w:val="1"/>
+    </w:lvlOverride>
+    <w:lvlOverride w:ilvl="3">
+      <w:startOverride w:val="1"/>
+    </w:lvlOverride>
+    <w:lvlOverride w:ilvl="4">
+      <w:startOverride w:val="1"/>
+    </w:lvlOverride>
+    <w:lvlOverride w:ilvl="5">
+      <w:startOverride w:val="1"/>
+    </w:lvlOverride>
+    <w:lvlOverride w:ilvl="6">
+      <w:startOverride w:val="1"/>
+    </w:lvlOverride>
+    <w:lvlOverride w:ilvl="7">
+      <w:startOverride w:val="1"/>
+    </w:lvlOverride>
+    <w:lvlOverride w:ilvl="8">
+      <w:startOverride w:val="1"/>
+    </w:lvlOverride>
+  </w:num>
+  <w:num w:numId="1035">
+    <w:abstractNumId w:val="991"/>
+  </w:num>
+  <w:num w:numId="1036">
     <w:abstractNumId w:val="99411"/>
     <w:lvlOverride w:ilvl="0">
       <w:startOverride w:val="1"/>

</xml_diff>

<commit_message>
Abu Ghazi Village: aid options for the new-money gap (Annex B); correct AICS call fit
Co-Authored-By: Claude Opus 5.5 (1M context) <noreply@anthropic.com>
Claude-Session: https://claude.ai/code/session_01SHa6crvVEuPcYfhvw5C66Y
</commit_message>
<xml_diff>
--- a/feasibility-study-team-of-agents/studies/abu-ghazi-village/feasibility-study.docx
+++ b/feasibility-study-team-of-agents/studies/abu-ghazi-village/feasibility-study.docx
@@ -8428,28 +8428,16 @@
             <w:r>
               <w:rPr>
                 <w:rtl/>
-              </w:rPr>
-              <w:t xml:space="preserve">متوسطة</w:t>
-            </w:r>
-            <w:r>
-              <w:rPr>
-                <w:rtl/>
-              </w:rPr>
-              <w:t xml:space="preserve"> </w:t>
-            </w:r>
-            <w:r>
-              <w:rPr>
-                <w:rtl/>
                 <w:bCs/>
                 <w:b/>
               </w:rPr>
-              <w:t xml:space="preserve">عبر شريك</w:t>
-            </w:r>
-            <w:r>
-              <w:rPr>
-                <w:rtl/>
-              </w:rPr>
-              <w:t xml:space="preserve">: جمعية أو تعاونية محلية لمكون الحرف وتشغيل النساء</w:t>
+              <w:t xml:space="preserve">غير ملائمة</w:t>
+            </w:r>
+            <w:r>
+              <w:rPr>
+                <w:rtl/>
+              </w:rPr>
+              <w:t xml:space="preserve">: المواقع المستهدفة أم قيس (أبيلا) ومكاور، لا البترا [SOURCE: fundsforNGOs، 15/10/2026]</w:t>
             </w:r>
           </w:p>
         </w:tc>
@@ -9728,7 +9716,7 @@
         <w:rPr>
           <w:rtl/>
         </w:rPr>
-        <w:t xml:space="preserve">منحة عبر شريك غير ربحي لمكون الحرف وتشغيل النساء والشباب (دعوة AMMAN_1/2026 وما يليها).</w:t>
+        <w:t xml:space="preserve">منحة عبر شريك غير ربحي لمكون الحرف وتشغيل النساء والشباب عند فتح دعوة تخص البترا (دعوة AMMAN_1/2026 لا تشمل البترا؛ انظر الملحق ب).</w:t>
       </w:r>
     </w:p>
     <w:p>
@@ -24425,6 +24413,1486 @@
     </w:p>
     <w:bookmarkEnd w:id="45"/>
     <w:bookmarkEnd w:id="46"/>
+    <w:bookmarkStart w:id="49" w:name="X5ce0ef16e977220197a6b6e445fb25ec8ee644d"/>
+    <w:p>
+      <w:pPr>
+        <w:pStyle w:val="Heading1"/>
+        <w:bidi/>
+      </w:pPr>
+      <w:r>
+        <w:rPr>
+          <w:rtl/>
+        </w:rPr>
+        <w:t xml:space="preserve">ملحق ب: مصادر الدعم والمنح لسد فجوة الـ54 ألفاً</w:t>
+      </w:r>
+    </w:p>
+    <w:p>
+      <w:pPr>
+        <w:bidi/>
+      </w:pPr>
+      <w:r>
+        <w:rPr>
+          <w:rtl/>
+        </w:rPr>
+        <w:t xml:space="preserve">تاريخ الفحص: 15/10/2026.</w:t>
+      </w:r>
+    </w:p>
+    <w:p>
+      <w:pPr>
+        <w:bidi/>
+      </w:pPr>
+      <w:r>
+        <w:rPr>
+          <w:rtl/>
+          <w:bCs/>
+          <w:b/>
+        </w:rPr>
+        <w:t xml:space="preserve">English summary.</w:t>
+      </w:r>
+      <w:r>
+        <w:rPr>
+          <w:rtl/>
+        </w:rPr>
+        <w:t xml:space="preserve"> </w:t>
+      </w:r>
+      <w:r>
+        <w:rPr>
+          <w:rtl/>
+        </w:rPr>
+        <w:t xml:space="preserve">No grant open today pays cash towards the building costs of a private, for-profit commercial complex in Wadi Musa. JEDCO grants are paused. The EU/AICS heritage call covers Abila and Mukawir, not Petra, and is for non-profits only. CARE’s small-business grants cover Amman and Zarqa. USAID programmes have stopped. The gap can still be closed with a stack of public support and tenant money. Each item is uncertain, so the bank case should count only what is signed:</w:t>
+      </w:r>
+      <w:r>
+        <w:rPr>
+          <w:rtl/>
+        </w:rPr>
+        <w:t xml:space="preserve"> </w:t>
+      </w:r>
+      <w:r>
+        <w:rPr>
+          <w:rtl/>
+        </w:rPr>
+        <w:t xml:space="preserve">(1) the July 2026 Petra relief package, which allows a one-year deferral of existing loans with the government paying the interest, about 26k of freed owner cash if the existing loan qualifies;</w:t>
+      </w:r>
+      <w:r>
+        <w:rPr>
+          <w:rtl/>
+        </w:rPr>
+        <w:t xml:space="preserve"> </w:t>
+      </w:r>
+      <w:r>
+        <w:rPr>
+          <w:rtl/>
+        </w:rPr>
+        <w:t xml:space="preserve">(2) the National Employment Programme wage subsidy, about 8k;</w:t>
+      </w:r>
+      <w:r>
+        <w:rPr>
+          <w:rtl/>
+        </w:rPr>
+        <w:t xml:space="preserve"> </w:t>
+      </w:r>
+      <w:r>
+        <w:rPr>
+          <w:rtl/>
+        </w:rPr>
+        <w:t xml:space="preserve">(3) advance rent from the restaurant and café tenants, about 16–20k;</w:t>
+      </w:r>
+      <w:r>
+        <w:rPr>
+          <w:rtl/>
+        </w:rPr>
+        <w:t xml:space="preserve"> </w:t>
+      </w:r>
+      <w:r>
+        <w:rPr>
+          <w:rtl/>
+        </w:rPr>
+        <w:t xml:space="preserve">(4) the investment-law sales-tax and customs exemption on fixed assets, if the project qualifies.</w:t>
+      </w:r>
+      <w:r>
+        <w:rPr>
+          <w:rtl/>
+        </w:rPr>
+        <w:t xml:space="preserve"> </w:t>
+      </w:r>
+      <w:r>
+        <w:rPr>
+          <w:rtl/>
+        </w:rPr>
+        <w:t xml:space="preserve">Grants for the gallery and crafts components should be pursued later through a non-profit partner.</w:t>
+      </w:r>
+    </w:p>
+    <w:bookmarkStart w:id="47" w:name="ب.1-الخيارات"/>
+    <w:p>
+      <w:pPr>
+        <w:pStyle w:val="Heading2"/>
+        <w:bidi/>
+      </w:pPr>
+      <w:r>
+        <w:rPr>
+          <w:rtl/>
+        </w:rPr>
+        <w:t xml:space="preserve">ب.1 الخيارات</w:t>
+      </w:r>
+    </w:p>
+    <w:tbl>
+      <w:tblPr>
+        <w:tblStyle w:val="Table"/>
+        <w:tblW w:type="pct" w:w="5000"/>
+        <w:tblLook w:firstRow="1" w:lastRow="0" w:firstColumn="0" w:lastColumn="0" w:noHBand="0" w:noVBand="0" w:val="0020"/>
+        <w:jc w:val="start"/>
+      </w:tblPr>
+      <w:tblGrid>
+        <w:gridCol w:w="1250"/>
+        <w:gridCol w:w="1250"/>
+        <w:gridCol w:w="1250"/>
+        <w:gridCol w:w="1667"/>
+        <w:gridCol w:w="1250"/>
+        <w:gridCol w:w="1250"/>
+      </w:tblGrid>
+      <w:tr>
+        <w:trPr>
+          <w:tblHeader w:val="true"/>
+        </w:trPr>
+        <w:tc>
+          <w:tcPr/>
+          <w:p>
+            <w:pPr>
+              <w:pStyle w:val="Compact"/>
+              <w:bidi/>
+              <w:jc w:val="left"/>
+            </w:pPr>
+            <w:r>
+              <w:rPr>
+                <w:rtl/>
+              </w:rPr>
+              <w:t xml:space="preserve">#</w:t>
+            </w:r>
+          </w:p>
+        </w:tc>
+        <w:tc>
+          <w:tcPr/>
+          <w:p>
+            <w:pPr>
+              <w:pStyle w:val="Compact"/>
+              <w:bidi/>
+              <w:jc w:val="left"/>
+            </w:pPr>
+            <w:r>
+              <w:rPr>
+                <w:rtl/>
+              </w:rPr>
+              <w:t xml:space="preserve">الأداة</w:t>
+            </w:r>
+          </w:p>
+        </w:tc>
+        <w:tc>
+          <w:tcPr/>
+          <w:p>
+            <w:pPr>
+              <w:pStyle w:val="Compact"/>
+              <w:bidi/>
+              <w:jc w:val="left"/>
+            </w:pPr>
+            <w:r>
+              <w:rPr>
+                <w:rtl/>
+              </w:rPr>
+              <w:t xml:space="preserve">ما تقدمه</w:t>
+            </w:r>
+          </w:p>
+        </w:tc>
+        <w:tc>
+          <w:tcPr/>
+          <w:p>
+            <w:pPr>
+              <w:pStyle w:val="Compact"/>
+              <w:bidi/>
+              <w:jc w:val="right"/>
+            </w:pPr>
+            <w:r>
+              <w:rPr>
+                <w:rtl/>
+              </w:rPr>
+              <w:t xml:space="preserve">الأثر على الفجوة</w:t>
+            </w:r>
+          </w:p>
+        </w:tc>
+        <w:tc>
+          <w:tcPr/>
+          <w:p>
+            <w:pPr>
+              <w:pStyle w:val="Compact"/>
+              <w:bidi/>
+              <w:jc w:val="left"/>
+            </w:pPr>
+            <w:r>
+              <w:rPr>
+                <w:rtl/>
+              </w:rPr>
+              <w:t xml:space="preserve">الأهلية والقيود</w:t>
+            </w:r>
+          </w:p>
+        </w:tc>
+        <w:tc>
+          <w:tcPr/>
+          <w:p>
+            <w:pPr>
+              <w:pStyle w:val="Compact"/>
+              <w:bidi/>
+              <w:jc w:val="left"/>
+            </w:pPr>
+            <w:r>
+              <w:rPr>
+                <w:rtl/>
+              </w:rPr>
+              <w:t xml:space="preserve">المصدر</w:t>
+            </w:r>
+          </w:p>
+        </w:tc>
+      </w:tr>
+      <w:tr>
+        <w:tc>
+          <w:tcPr/>
+          <w:p>
+            <w:pPr>
+              <w:pStyle w:val="Compact"/>
+              <w:bidi/>
+              <w:jc w:val="left"/>
+            </w:pPr>
+            <w:r>
+              <w:rPr>
+                <w:rtl/>
+              </w:rPr>
+              <w:t xml:space="preserve">1</w:t>
+            </w:r>
+          </w:p>
+        </w:tc>
+        <w:tc>
+          <w:tcPr/>
+          <w:p>
+            <w:pPr>
+              <w:pStyle w:val="Compact"/>
+              <w:bidi/>
+              <w:jc w:val="left"/>
+            </w:pPr>
+            <w:r>
+              <w:rPr>
+                <w:rtl/>
+              </w:rPr>
+              <w:t xml:space="preserve">حزمة دعم البترا (5 ملايين دينار، مجلس الوزراء 27/7/2026)</w:t>
+            </w:r>
+          </w:p>
+        </w:tc>
+        <w:tc>
+          <w:tcPr/>
+          <w:p>
+            <w:pPr>
+              <w:pStyle w:val="Compact"/>
+              <w:bidi/>
+              <w:jc w:val="left"/>
+            </w:pPr>
+            <w:r>
+              <w:rPr>
+                <w:rtl/>
+              </w:rPr>
+              <w:t xml:space="preserve">تأجيل أقساط قروض منشآت البترا سنة، والحكومة تتحمل الفوائد (نحو 2.27 مليون إجمالاً)، وجدولة الضريبة والكهرباء والماء دون غرامات</w:t>
+            </w:r>
+          </w:p>
+        </w:tc>
+        <w:tc>
+          <w:tcPr/>
+          <w:p>
+            <w:pPr>
+              <w:pStyle w:val="Compact"/>
+              <w:bidi/>
+              <w:jc w:val="right"/>
+            </w:pPr>
+            <w:r>
+              <w:rPr>
+                <w:rtl/>
+              </w:rPr>
+              <w:t xml:space="preserve">نحو</w:t>
+            </w:r>
+            <w:r>
+              <w:rPr>
+                <w:rtl/>
+              </w:rPr>
+              <w:t xml:space="preserve"> </w:t>
+            </w:r>
+            <w:r>
+              <w:rPr>
+                <w:rtl/>
+                <w:bCs/>
+                <w:b/>
+              </w:rPr>
+              <w:t xml:space="preserve">26,000</w:t>
+            </w:r>
+            <w:r>
+              <w:rPr>
+                <w:rtl/>
+              </w:rPr>
+              <w:t xml:space="preserve"> </w:t>
+            </w:r>
+            <w:r>
+              <w:rPr>
+                <w:rtl/>
+              </w:rPr>
+              <w:t xml:space="preserve">نقداً يتحرر للمالك في سنة البناء، إن كان القسط الحالي قرابة 2,182 شهرياً [ASSUMPTION: 140 ألفاً بفائدة 8% و7 سنوات متبقية]</w:t>
+            </w:r>
+          </w:p>
+        </w:tc>
+        <w:tc>
+          <w:tcPr/>
+          <w:p>
+            <w:pPr>
+              <w:pStyle w:val="Compact"/>
+              <w:bidi/>
+              <w:jc w:val="left"/>
+            </w:pPr>
+            <w:r>
+              <w:rPr>
+                <w:rtl/>
+              </w:rPr>
+              <w:t xml:space="preserve">يشترط على الأرجح منشأة سياحية مرخصة في الإقليم، والمشروع لم يُرخص بعد [VERIFY: وزارة السياحة وسلطة الإقليم]. ينطبق فقط إذا بقي القرض القائم سنة البناء ثم أُعيد تمويله عند السحب</w:t>
+            </w:r>
+          </w:p>
+        </w:tc>
+        <w:tc>
+          <w:tcPr/>
+          <w:p>
+            <w:pPr>
+              <w:pStyle w:val="Compact"/>
+              <w:bidi/>
+              <w:jc w:val="left"/>
+            </w:pPr>
+            <w:r>
+              <w:rPr>
+                <w:rtl/>
+              </w:rPr>
+              <w:t xml:space="preserve">[SOURCE: TravelDailyNews و Enterprise، 28–29/7/2026]</w:t>
+            </w:r>
+          </w:p>
+        </w:tc>
+      </w:tr>
+      <w:tr>
+        <w:tc>
+          <w:tcPr/>
+          <w:p>
+            <w:pPr>
+              <w:pStyle w:val="Compact"/>
+              <w:bidi/>
+              <w:jc w:val="left"/>
+            </w:pPr>
+            <w:r>
+              <w:rPr>
+                <w:rtl/>
+              </w:rPr>
+              <w:t xml:space="preserve">2</w:t>
+            </w:r>
+          </w:p>
+        </w:tc>
+        <w:tc>
+          <w:tcPr/>
+          <w:p>
+            <w:pPr>
+              <w:pStyle w:val="Compact"/>
+              <w:bidi/>
+              <w:jc w:val="left"/>
+            </w:pPr>
+            <w:r>
+              <w:rPr>
+                <w:rtl/>
+              </w:rPr>
+              <w:t xml:space="preserve">البرنامج الوطني للتشغيل (وزارة العمل، منصة</w:t>
+            </w:r>
+            <w:r>
+              <w:rPr>
+                <w:rtl/>
+              </w:rPr>
+              <w:t xml:space="preserve"> </w:t>
+            </w:r>
+            <w:r>
+              <w:rPr>
+                <w:rtl/>
+              </w:rPr>
+              <w:t xml:space="preserve">“</w:t>
+            </w:r>
+            <w:r>
+              <w:rPr>
+                <w:rtl/>
+              </w:rPr>
+              <w:t xml:space="preserve">تشغيل</w:t>
+            </w:r>
+            <w:r>
+              <w:rPr>
+                <w:rtl/>
+              </w:rPr>
+              <w:t xml:space="preserve">”</w:t>
+            </w:r>
+            <w:r>
+              <w:rPr>
+                <w:rtl/>
+              </w:rPr>
+              <w:t xml:space="preserve">)</w:t>
+            </w:r>
+          </w:p>
+        </w:tc>
+        <w:tc>
+          <w:tcPr/>
+          <w:p>
+            <w:pPr>
+              <w:pStyle w:val="Compact"/>
+              <w:bidi/>
+              <w:jc w:val="left"/>
+            </w:pPr>
+            <w:r>
+              <w:rPr>
+                <w:rtl/>
+              </w:rPr>
+              <w:t xml:space="preserve">145 ديناراً للأجر + 10 مواصلات + 12 ضماناً اجتماعياً شهرياً لكل عامل أردني (18–45 سنة)، و15 إضافية للمرأة، لمدة 6 أشهر ضمن عقد 12 شهراً</w:t>
+            </w:r>
+          </w:p>
+        </w:tc>
+        <w:tc>
+          <w:tcPr/>
+          <w:p>
+            <w:pPr>
+              <w:pStyle w:val="Compact"/>
+              <w:bidi/>
+              <w:jc w:val="right"/>
+            </w:pPr>
+            <w:r>
+              <w:rPr>
+                <w:rtl/>
+              </w:rPr>
+              <w:t xml:space="preserve">نحو</w:t>
+            </w:r>
+            <w:r>
+              <w:rPr>
+                <w:rtl/>
+              </w:rPr>
+              <w:t xml:space="preserve"> </w:t>
+            </w:r>
+            <w:r>
+              <w:rPr>
+                <w:rtl/>
+                <w:bCs/>
+                <w:b/>
+              </w:rPr>
+              <w:t xml:space="preserve">8,000</w:t>
+            </w:r>
+            <w:r>
+              <w:rPr>
+                <w:rtl/>
+              </w:rPr>
+              <w:t xml:space="preserve"> </w:t>
+            </w:r>
+            <w:r>
+              <w:rPr>
+                <w:rtl/>
+              </w:rPr>
+              <w:t xml:space="preserve">في السنة 1 (8 وظائف × 167 × 6) [ASSUMPTION: كل الموظفين مؤهلون]</w:t>
+            </w:r>
+          </w:p>
+        </w:tc>
+        <w:tc>
+          <w:tcPr/>
+          <w:p>
+            <w:pPr>
+              <w:pStyle w:val="Compact"/>
+              <w:bidi/>
+              <w:jc w:val="left"/>
+            </w:pPr>
+            <w:r>
+              <w:rPr>
+                <w:rtl/>
+              </w:rPr>
+              <w:t xml:space="preserve">تسجيل في وزارة الصناعة والتجارة والضمان الاجتماعي؛ التوظيف بعقد سنة والإبقاء 6 أشهر بعد الدعم</w:t>
+            </w:r>
+          </w:p>
+        </w:tc>
+        <w:tc>
+          <w:tcPr/>
+          <w:p>
+            <w:pPr>
+              <w:pStyle w:val="Compact"/>
+              <w:bidi/>
+              <w:jc w:val="left"/>
+            </w:pPr>
+            <w:r>
+              <w:rPr>
+                <w:rtl/>
+              </w:rPr>
+              <w:t xml:space="preserve">[SOURCE: دليل سؤال وجواب، mol.gov.jo، 2026]</w:t>
+            </w:r>
+          </w:p>
+        </w:tc>
+      </w:tr>
+      <w:tr>
+        <w:tc>
+          <w:tcPr/>
+          <w:p>
+            <w:pPr>
+              <w:pStyle w:val="Compact"/>
+              <w:bidi/>
+              <w:jc w:val="left"/>
+            </w:pPr>
+            <w:r>
+              <w:rPr>
+                <w:rtl/>
+              </w:rPr>
+              <w:t xml:space="preserve">3</w:t>
+            </w:r>
+          </w:p>
+        </w:tc>
+        <w:tc>
+          <w:tcPr/>
+          <w:p>
+            <w:pPr>
+              <w:pStyle w:val="Compact"/>
+              <w:bidi/>
+              <w:jc w:val="left"/>
+            </w:pPr>
+            <w:r>
+              <w:rPr>
+                <w:rtl/>
+              </w:rPr>
+              <w:t xml:space="preserve">دفعة إيجار مقدمة من مستأجري المطعم والمقهى</w:t>
+            </w:r>
+          </w:p>
+        </w:tc>
+        <w:tc>
+          <w:tcPr/>
+          <w:p>
+            <w:pPr>
+              <w:pStyle w:val="Compact"/>
+              <w:bidi/>
+              <w:jc w:val="left"/>
+            </w:pPr>
+            <w:r>
+              <w:rPr>
+                <w:rtl/>
+              </w:rPr>
+              <w:t xml:space="preserve">6 أشهر مقدماً من المطعم والمقهى (2,675.84 شهرياً) أو 12 شهراً من المطعم</w:t>
+            </w:r>
+          </w:p>
+        </w:tc>
+        <w:tc>
+          <w:tcPr/>
+          <w:p>
+            <w:pPr>
+              <w:pStyle w:val="Compact"/>
+              <w:bidi/>
+              <w:jc w:val="right"/>
+            </w:pPr>
+            <w:r>
+              <w:rPr>
+                <w:rtl/>
+                <w:bCs/>
+                <w:b/>
+              </w:rPr>
+              <w:t xml:space="preserve">16,055 إلى 20,145</w:t>
+            </w:r>
+          </w:p>
+        </w:tc>
+        <w:tc>
+          <w:tcPr/>
+          <w:p>
+            <w:pPr>
+              <w:pStyle w:val="Compact"/>
+              <w:bidi/>
+              <w:jc w:val="left"/>
+            </w:pPr>
+            <w:r>
+              <w:rPr>
+                <w:rtl/>
+              </w:rPr>
+              <w:t xml:space="preserve">تفاوض ضمن خطابات النوايا؛ يخفض إيراد السنة 1 النقدي بالمقدار نفسه لاحقاً</w:t>
+            </w:r>
+          </w:p>
+        </w:tc>
+        <w:tc>
+          <w:tcPr/>
+          <w:p>
+            <w:pPr>
+              <w:pStyle w:val="Compact"/>
+              <w:bidi/>
+              <w:jc w:val="left"/>
+            </w:pPr>
+            <w:r>
+              <w:rPr>
+                <w:rtl/>
+              </w:rPr>
+              <w:t xml:space="preserve">[ASSUMPTION][SOURCE: الإيجارات من موجز المالك]</w:t>
+            </w:r>
+          </w:p>
+        </w:tc>
+      </w:tr>
+      <w:tr>
+        <w:tc>
+          <w:tcPr/>
+          <w:p>
+            <w:pPr>
+              <w:pStyle w:val="Compact"/>
+              <w:bidi/>
+              <w:jc w:val="left"/>
+            </w:pPr>
+            <w:r>
+              <w:rPr>
+                <w:rtl/>
+              </w:rPr>
+              <w:t xml:space="preserve">4</w:t>
+            </w:r>
+          </w:p>
+        </w:tc>
+        <w:tc>
+          <w:tcPr/>
+          <w:p>
+            <w:pPr>
+              <w:pStyle w:val="Compact"/>
+              <w:bidi/>
+              <w:jc w:val="left"/>
+            </w:pPr>
+            <w:r>
+              <w:rPr>
+                <w:rtl/>
+              </w:rPr>
+              <w:t xml:space="preserve">إعفاءات قانون البيئة الاستثمارية</w:t>
+            </w:r>
+          </w:p>
+        </w:tc>
+        <w:tc>
+          <w:tcPr/>
+          <w:p>
+            <w:pPr>
+              <w:pStyle w:val="Compact"/>
+              <w:bidi/>
+              <w:jc w:val="left"/>
+            </w:pPr>
+            <w:r>
+              <w:rPr>
+                <w:rtl/>
+              </w:rPr>
+              <w:t xml:space="preserve">إعفاء أو تخفيض ضريبة المبيعات والجمارك على الموجودات الثابتة للأنشطة المؤهلة</w:t>
+            </w:r>
+          </w:p>
+        </w:tc>
+        <w:tc>
+          <w:tcPr/>
+          <w:p>
+            <w:pPr>
+              <w:pStyle w:val="Compact"/>
+              <w:bidi/>
+              <w:jc w:val="right"/>
+            </w:pPr>
+            <w:r>
+              <w:rPr>
+                <w:rtl/>
+              </w:rPr>
+              <w:t xml:space="preserve">غير محدد؛ يعتمد على حصة المعدات والمواد في جدول الكميات</w:t>
+            </w:r>
+          </w:p>
+        </w:tc>
+        <w:tc>
+          <w:tcPr/>
+          <w:p>
+            <w:pPr>
+              <w:pStyle w:val="Compact"/>
+              <w:bidi/>
+              <w:jc w:val="left"/>
+            </w:pPr>
+            <w:r>
+              <w:rPr>
+                <w:rtl/>
+              </w:rPr>
+              <w:t xml:space="preserve">[VERIFY: هل</w:t>
+            </w:r>
+            <w:r>
+              <w:rPr>
+                <w:rtl/>
+              </w:rPr>
+              <w:t xml:space="preserve"> </w:t>
+            </w:r>
+            <w:r>
+              <w:rPr>
+                <w:rtl/>
+              </w:rPr>
+              <w:t xml:space="preserve">“</w:t>
+            </w:r>
+            <w:r>
+              <w:rPr>
+                <w:rtl/>
+              </w:rPr>
+              <w:t xml:space="preserve">مجمع تجاري تراثي</w:t>
+            </w:r>
+            <w:r>
+              <w:rPr>
+                <w:rtl/>
+              </w:rPr>
+              <w:t xml:space="preserve">”</w:t>
+            </w:r>
+            <w:r>
+              <w:rPr>
+                <w:rtl/>
+              </w:rPr>
+              <w:t xml:space="preserve"> </w:t>
+            </w:r>
+            <w:r>
+              <w:rPr>
+                <w:rtl/>
+              </w:rPr>
+              <w:t xml:space="preserve">نشاط مؤهل في وزارة الاستثمار، وهل جدول الكميات يشمل ضريبة 16%]</w:t>
+            </w:r>
+          </w:p>
+        </w:tc>
+        <w:tc>
+          <w:tcPr/>
+          <w:p>
+            <w:pPr>
+              <w:pStyle w:val="Compact"/>
+              <w:bidi/>
+              <w:jc w:val="left"/>
+            </w:pPr>
+            <w:r>
+              <w:rPr>
+                <w:rtl/>
+              </w:rPr>
+              <w:t xml:space="preserve">[SOURCE: قانون 2014 السابق عبر التميمي؛ قانون 2022 لم يُتحقق منه]</w:t>
+            </w:r>
+          </w:p>
+        </w:tc>
+      </w:tr>
+      <w:tr>
+        <w:tc>
+          <w:tcPr/>
+          <w:p>
+            <w:pPr>
+              <w:pStyle w:val="Compact"/>
+              <w:bidi/>
+              <w:jc w:val="left"/>
+            </w:pPr>
+            <w:r>
+              <w:rPr>
+                <w:rtl/>
+              </w:rPr>
+              <w:t xml:space="preserve">5</w:t>
+            </w:r>
+          </w:p>
+        </w:tc>
+        <w:tc>
+          <w:tcPr/>
+          <w:p>
+            <w:pPr>
+              <w:pStyle w:val="Compact"/>
+              <w:bidi/>
+              <w:jc w:val="left"/>
+            </w:pPr>
+            <w:r>
+              <w:rPr>
+                <w:rtl/>
+              </w:rPr>
+              <w:t xml:space="preserve">منح المعرض والحرف عبر شريك غير ربحي (دعوة اليونسكو والتعاون الإيطالي للنساء في البترا ووادي رم أُغلقت 3/5/2026؛ مشروع جايكا للسياحة المجتمعية)</w:t>
+            </w:r>
+          </w:p>
+        </w:tc>
+        <w:tc>
+          <w:tcPr/>
+          <w:p>
+            <w:pPr>
+              <w:pStyle w:val="Compact"/>
+              <w:bidi/>
+              <w:jc w:val="left"/>
+            </w:pPr>
+            <w:r>
+              <w:rPr>
+                <w:rtl/>
+              </w:rPr>
+              <w:t xml:space="preserve">منحة أو دعم عيني لمكون الحرف وتشغيل النساء</w:t>
+            </w:r>
+          </w:p>
+        </w:tc>
+        <w:tc>
+          <w:tcPr/>
+          <w:p>
+            <w:pPr>
+              <w:pStyle w:val="Compact"/>
+              <w:bidi/>
+              <w:jc w:val="right"/>
+            </w:pPr>
+            <w:r>
+              <w:rPr>
+                <w:rtl/>
+              </w:rPr>
+              <w:t xml:space="preserve">0 الآن؛ للمرحلة الثانية من المعرض لاحقاً</w:t>
+            </w:r>
+          </w:p>
+        </w:tc>
+        <w:tc>
+          <w:tcPr/>
+          <w:p>
+            <w:pPr>
+              <w:pStyle w:val="Compact"/>
+              <w:bidi/>
+              <w:jc w:val="left"/>
+            </w:pPr>
+            <w:r>
+              <w:rPr>
+                <w:rtl/>
+              </w:rPr>
+              <w:t xml:space="preserve">المالك شركة ربحية، لذلك يكون المتقدم جمعية محلية ويكون المشروع موقع التنفيذ</w:t>
+            </w:r>
+          </w:p>
+        </w:tc>
+        <w:tc>
+          <w:tcPr/>
+          <w:p>
+            <w:pPr>
+              <w:pStyle w:val="Compact"/>
+              <w:bidi/>
+              <w:jc w:val="left"/>
+            </w:pPr>
+            <w:r>
+              <w:rPr>
+                <w:rtl/>
+              </w:rPr>
+              <w:t xml:space="preserve">[SOURCE: بترا، 28/4/2026]</w:t>
+            </w:r>
+          </w:p>
+        </w:tc>
+      </w:tr>
+      <w:tr>
+        <w:tc>
+          <w:tcPr/>
+          <w:p>
+            <w:pPr>
+              <w:pStyle w:val="Compact"/>
+              <w:bidi/>
+              <w:jc w:val="left"/>
+            </w:pPr>
+            <w:r>
+              <w:rPr>
+                <w:rtl/>
+              </w:rPr>
+              <w:t xml:space="preserve">6</w:t>
+            </w:r>
+          </w:p>
+        </w:tc>
+        <w:tc>
+          <w:tcPr/>
+          <w:p>
+            <w:pPr>
+              <w:pStyle w:val="Compact"/>
+              <w:bidi/>
+              <w:jc w:val="left"/>
+            </w:pPr>
+            <w:r>
+              <w:rPr>
+                <w:rtl/>
+              </w:rPr>
+              <w:t xml:space="preserve">برنامج</w:t>
+            </w:r>
+            <w:r>
+              <w:rPr>
+                <w:rtl/>
+              </w:rPr>
+              <w:t xml:space="preserve"> </w:t>
+            </w:r>
+            <w:r>
+              <w:rPr>
+                <w:rtl/>
+              </w:rPr>
+              <w:t xml:space="preserve">“</w:t>
+            </w:r>
+            <w:r>
+              <w:rPr>
+                <w:rtl/>
+              </w:rPr>
+              <w:t xml:space="preserve">ضمان من أجل التشغيل</w:t>
+            </w:r>
+            <w:r>
+              <w:rPr>
+                <w:rtl/>
+              </w:rPr>
+              <w:t xml:space="preserve">”</w:t>
+            </w:r>
+            <w:r>
+              <w:rPr>
+                <w:rtl/>
+              </w:rPr>
+              <w:t xml:space="preserve"> </w:t>
+            </w:r>
+            <w:r>
+              <w:rPr>
+                <w:rtl/>
+              </w:rPr>
+              <w:t xml:space="preserve">(ألمانيا/KfW عبر الشركة الأردنية لضمان القروض)</w:t>
+            </w:r>
+          </w:p>
+        </w:tc>
+        <w:tc>
+          <w:tcPr/>
+          <w:p>
+            <w:pPr>
+              <w:pStyle w:val="Compact"/>
+              <w:bidi/>
+              <w:jc w:val="left"/>
+            </w:pPr>
+            <w:r>
+              <w:rPr>
+                <w:rtl/>
+              </w:rPr>
+              <w:t xml:space="preserve">ضمان وليس منحة</w:t>
+            </w:r>
+          </w:p>
+        </w:tc>
+        <w:tc>
+          <w:tcPr/>
+          <w:p>
+            <w:pPr>
+              <w:pStyle w:val="Compact"/>
+              <w:bidi/>
+              <w:jc w:val="right"/>
+            </w:pPr>
+            <w:r>
+              <w:rPr>
+                <w:rtl/>
+              </w:rPr>
+              <w:t xml:space="preserve">يخفض طلب الضمانات لا الفجوة</w:t>
+            </w:r>
+          </w:p>
+        </w:tc>
+        <w:tc>
+          <w:tcPr/>
+          <w:p>
+            <w:pPr>
+              <w:pStyle w:val="Compact"/>
+              <w:bidi/>
+              <w:jc w:val="left"/>
+            </w:pPr>
+            <w:r>
+              <w:rPr>
+                <w:rtl/>
+              </w:rPr>
+              <w:t xml:space="preserve">[VERIFY]</w:t>
+            </w:r>
+          </w:p>
+        </w:tc>
+        <w:tc>
+          <w:tcPr/>
+          <w:p>
+            <w:pPr>
+              <w:pStyle w:val="Compact"/>
+              <w:bidi/>
+              <w:jc w:val="left"/>
+            </w:pPr>
+            <w:r>
+              <w:rPr>
+                <w:rtl/>
+              </w:rPr>
+              <w:t xml:space="preserve">[SOURCE: بترا، 3/8/2026]</w:t>
+            </w:r>
+          </w:p>
+        </w:tc>
+      </w:tr>
+      <w:tr>
+        <w:tc>
+          <w:tcPr/>
+          <w:p>
+            <w:pPr>
+              <w:pStyle w:val="Compact"/>
+              <w:bidi/>
+              <w:jc w:val="left"/>
+            </w:pPr>
+            <w:r>
+              <w:rPr>
+                <w:rtl/>
+              </w:rPr>
+              <w:t xml:space="preserve">–</w:t>
+            </w:r>
+          </w:p>
+        </w:tc>
+        <w:tc>
+          <w:tcPr/>
+          <w:p>
+            <w:pPr>
+              <w:pStyle w:val="Compact"/>
+              <w:bidi/>
+              <w:jc w:val="left"/>
+            </w:pPr>
+            <w:r>
+              <w:rPr>
+                <w:rtl/>
+              </w:rPr>
+              <w:t xml:space="preserve">غير متاح: منح جيدكو (متوقفة)، دعوة AMMAN_1/2026 (أبيلا ومكاور)، منح كير (عمّان والزرقاء)، الوكالة الأمريكية (متوقفة)، صندوق الشركات الناشئة ISSF (للابتكار)</w:t>
+            </w:r>
+          </w:p>
+        </w:tc>
+        <w:tc>
+          <w:tcPr/>
+          <w:p>
+            <w:pPr>
+              <w:pStyle w:val="Compact"/>
+              <w:bidi/>
+              <w:jc w:val="left"/>
+            </w:pPr>
+            <w:r>
+              <w:rPr>
+                <w:rtl/>
+              </w:rPr>
+              <w:t xml:space="preserve">–</w:t>
+            </w:r>
+          </w:p>
+        </w:tc>
+        <w:tc>
+          <w:tcPr/>
+          <w:p>
+            <w:pPr>
+              <w:pStyle w:val="Compact"/>
+              <w:bidi/>
+              <w:jc w:val="right"/>
+            </w:pPr>
+            <w:r>
+              <w:rPr>
+                <w:rtl/>
+              </w:rPr>
+              <w:t xml:space="preserve">0</w:t>
+            </w:r>
+          </w:p>
+        </w:tc>
+        <w:tc>
+          <w:tcPr/>
+          <w:p>
+            <w:pPr>
+              <w:pStyle w:val="Compact"/>
+              <w:bidi/>
+              <w:jc w:val="left"/>
+            </w:pPr>
+            <w:r>
+              <w:rPr>
+                <w:rtl/>
+              </w:rPr>
+              <w:t xml:space="preserve">–</w:t>
+            </w:r>
+          </w:p>
+        </w:tc>
+        <w:tc>
+          <w:tcPr/>
+          <w:p>
+            <w:pPr>
+              <w:pStyle w:val="Compact"/>
+              <w:bidi/>
+              <w:jc w:val="left"/>
+            </w:pPr>
+            <w:r>
+              <w:rPr>
+                <w:rtl/>
+              </w:rPr>
+              <w:t xml:space="preserve">[SOURCE: بحث 15/10/2026]</w:t>
+            </w:r>
+          </w:p>
+        </w:tc>
+      </w:tr>
+    </w:tbl>
+    <w:bookmarkEnd w:id="47"/>
+    <w:bookmarkStart w:id="48" w:name="ب.2-الحزمة-المقترحة"/>
+    <w:p>
+      <w:pPr>
+        <w:pStyle w:val="Heading2"/>
+        <w:bidi/>
+      </w:pPr>
+      <w:r>
+        <w:rPr>
+          <w:rtl/>
+        </w:rPr>
+        <w:t xml:space="preserve">ب.2 الحزمة المقترحة</w:t>
+      </w:r>
+    </w:p>
+    <w:tbl>
+      <w:tblPr>
+        <w:tblStyle w:val="Table"/>
+        <w:tblW w:type="pct" w:w="5000"/>
+        <w:tblLook w:firstRow="1" w:lastRow="0" w:firstColumn="0" w:lastColumn="0" w:noHBand="0" w:noVBand="0" w:val="0020"/>
+        <w:jc w:val="start"/>
+      </w:tblPr>
+      <w:tblGrid>
+        <w:gridCol w:w="2160"/>
+        <w:gridCol w:w="2880"/>
+        <w:gridCol w:w="2880"/>
+      </w:tblGrid>
+      <w:tr>
+        <w:trPr>
+          <w:tblHeader w:val="true"/>
+        </w:trPr>
+        <w:tc>
+          <w:tcPr/>
+          <w:p>
+            <w:pPr>
+              <w:pStyle w:val="Compact"/>
+              <w:bidi/>
+              <w:jc w:val="left"/>
+            </w:pPr>
+            <w:r>
+              <w:rPr>
+                <w:rtl/>
+              </w:rPr>
+              <w:t xml:space="preserve">البند</w:t>
+            </w:r>
+          </w:p>
+        </w:tc>
+        <w:tc>
+          <w:tcPr/>
+          <w:p>
+            <w:pPr>
+              <w:pStyle w:val="Compact"/>
+              <w:bidi/>
+              <w:jc w:val="right"/>
+            </w:pPr>
+            <w:r>
+              <w:rPr>
+                <w:rtl/>
+              </w:rPr>
+              <w:t xml:space="preserve">الحالة المتحفظة</w:t>
+            </w:r>
+          </w:p>
+        </w:tc>
+        <w:tc>
+          <w:tcPr/>
+          <w:p>
+            <w:pPr>
+              <w:pStyle w:val="Compact"/>
+              <w:bidi/>
+              <w:jc w:val="right"/>
+            </w:pPr>
+            <w:r>
+              <w:rPr>
+                <w:rtl/>
+              </w:rPr>
+              <w:t xml:space="preserve">الحالة الكاملة</w:t>
+            </w:r>
+          </w:p>
+        </w:tc>
+      </w:tr>
+      <w:tr>
+        <w:tc>
+          <w:tcPr/>
+          <w:p>
+            <w:pPr>
+              <w:pStyle w:val="Compact"/>
+              <w:bidi/>
+              <w:jc w:val="left"/>
+            </w:pPr>
+            <w:r>
+              <w:rPr>
+                <w:rtl/>
+              </w:rPr>
+              <w:t xml:space="preserve">دعم الأجور (البرنامج الوطني للتشغيل)</w:t>
+            </w:r>
+          </w:p>
+        </w:tc>
+        <w:tc>
+          <w:tcPr/>
+          <w:p>
+            <w:pPr>
+              <w:pStyle w:val="Compact"/>
+              <w:bidi/>
+              <w:jc w:val="right"/>
+            </w:pPr>
+            <w:r>
+              <w:rPr>
+                <w:rtl/>
+              </w:rPr>
+              <w:t xml:space="preserve">8,000</w:t>
+            </w:r>
+          </w:p>
+        </w:tc>
+        <w:tc>
+          <w:tcPr/>
+          <w:p>
+            <w:pPr>
+              <w:pStyle w:val="Compact"/>
+              <w:bidi/>
+              <w:jc w:val="right"/>
+            </w:pPr>
+            <w:r>
+              <w:rPr>
+                <w:rtl/>
+              </w:rPr>
+              <w:t xml:space="preserve">8,000</w:t>
+            </w:r>
+          </w:p>
+        </w:tc>
+      </w:tr>
+      <w:tr>
+        <w:tc>
+          <w:tcPr/>
+          <w:p>
+            <w:pPr>
+              <w:pStyle w:val="Compact"/>
+              <w:bidi/>
+              <w:jc w:val="left"/>
+            </w:pPr>
+            <w:r>
+              <w:rPr>
+                <w:rtl/>
+              </w:rPr>
+              <w:t xml:space="preserve">إيجار مقدم</w:t>
+            </w:r>
+          </w:p>
+        </w:tc>
+        <w:tc>
+          <w:tcPr/>
+          <w:p>
+            <w:pPr>
+              <w:pStyle w:val="Compact"/>
+              <w:bidi/>
+              <w:jc w:val="right"/>
+            </w:pPr>
+            <w:r>
+              <w:rPr>
+                <w:rtl/>
+              </w:rPr>
+              <w:t xml:space="preserve">16,055</w:t>
+            </w:r>
+          </w:p>
+        </w:tc>
+        <w:tc>
+          <w:tcPr/>
+          <w:p>
+            <w:pPr>
+              <w:pStyle w:val="Compact"/>
+              <w:bidi/>
+              <w:jc w:val="right"/>
+            </w:pPr>
+            <w:r>
+              <w:rPr>
+                <w:rtl/>
+              </w:rPr>
+              <w:t xml:space="preserve">20,145</w:t>
+            </w:r>
+          </w:p>
+        </w:tc>
+      </w:tr>
+      <w:tr>
+        <w:tc>
+          <w:tcPr/>
+          <w:p>
+            <w:pPr>
+              <w:pStyle w:val="Compact"/>
+              <w:bidi/>
+              <w:jc w:val="left"/>
+            </w:pPr>
+            <w:r>
+              <w:rPr>
+                <w:rtl/>
+              </w:rPr>
+              <w:t xml:space="preserve">تأجيل القرض القائم (حزمة البترا)</w:t>
+            </w:r>
+          </w:p>
+        </w:tc>
+        <w:tc>
+          <w:tcPr/>
+          <w:p>
+            <w:pPr>
+              <w:pStyle w:val="Compact"/>
+              <w:bidi/>
+              <w:jc w:val="right"/>
+            </w:pPr>
+            <w:r>
+              <w:rPr>
+                <w:rtl/>
+              </w:rPr>
+              <w:t xml:space="preserve">0</w:t>
+            </w:r>
+          </w:p>
+        </w:tc>
+        <w:tc>
+          <w:tcPr/>
+          <w:p>
+            <w:pPr>
+              <w:pStyle w:val="Compact"/>
+              <w:bidi/>
+              <w:jc w:val="right"/>
+            </w:pPr>
+            <w:r>
+              <w:rPr>
+                <w:rtl/>
+              </w:rPr>
+              <w:t xml:space="preserve">26,000</w:t>
+            </w:r>
+          </w:p>
+        </w:tc>
+      </w:tr>
+      <w:tr>
+        <w:tc>
+          <w:tcPr/>
+          <w:p>
+            <w:pPr>
+              <w:pStyle w:val="Compact"/>
+              <w:bidi/>
+              <w:jc w:val="left"/>
+            </w:pPr>
+            <w:r>
+              <w:rPr>
+                <w:rtl/>
+                <w:bCs/>
+                <w:b/>
+              </w:rPr>
+              <w:t xml:space="preserve">المجموع</w:t>
+            </w:r>
+          </w:p>
+        </w:tc>
+        <w:tc>
+          <w:tcPr/>
+          <w:p>
+            <w:pPr>
+              <w:pStyle w:val="Compact"/>
+              <w:bidi/>
+              <w:jc w:val="right"/>
+            </w:pPr>
+            <w:r>
+              <w:rPr>
+                <w:rtl/>
+                <w:bCs/>
+                <w:b/>
+              </w:rPr>
+              <w:t xml:space="preserve">24,055</w:t>
+            </w:r>
+          </w:p>
+        </w:tc>
+        <w:tc>
+          <w:tcPr/>
+          <w:p>
+            <w:pPr>
+              <w:pStyle w:val="Compact"/>
+              <w:bidi/>
+              <w:jc w:val="right"/>
+            </w:pPr>
+            <w:r>
+              <w:rPr>
+                <w:rtl/>
+                <w:bCs/>
+                <w:b/>
+              </w:rPr>
+              <w:t xml:space="preserve">54,145</w:t>
+            </w:r>
+          </w:p>
+        </w:tc>
+      </w:tr>
+      <w:tr>
+        <w:tc>
+          <w:tcPr/>
+          <w:p>
+            <w:pPr>
+              <w:pStyle w:val="Compact"/>
+              <w:bidi/>
+              <w:jc w:val="left"/>
+            </w:pPr>
+            <w:r>
+              <w:rPr>
+                <w:rtl/>
+              </w:rPr>
+              <w:t xml:space="preserve">المتبقي من الفجوة (54,000)</w:t>
+            </w:r>
+          </w:p>
+        </w:tc>
+        <w:tc>
+          <w:tcPr/>
+          <w:p>
+            <w:pPr>
+              <w:pStyle w:val="Compact"/>
+              <w:bidi/>
+              <w:jc w:val="right"/>
+            </w:pPr>
+            <w:r>
+              <w:rPr>
+                <w:rtl/>
+              </w:rPr>
+              <w:t xml:space="preserve">نحو 30,000 من المالك أو بتأجيل بنود</w:t>
+            </w:r>
+          </w:p>
+        </w:tc>
+        <w:tc>
+          <w:tcPr/>
+          <w:p>
+            <w:pPr>
+              <w:pStyle w:val="Compact"/>
+              <w:bidi/>
+              <w:jc w:val="right"/>
+            </w:pPr>
+            <w:r>
+              <w:rPr>
+                <w:rtl/>
+              </w:rPr>
+              <w:t xml:space="preserve">نحو 0</w:t>
+            </w:r>
+          </w:p>
+        </w:tc>
+      </w:tr>
+    </w:tbl>
+    <w:p>
+      <w:pPr>
+        <w:bidi/>
+      </w:pPr>
+      <w:r>
+        <w:rPr>
+          <w:rtl/>
+          <w:bCs/>
+          <w:b/>
+        </w:rPr>
+        <w:t xml:space="preserve">التوصية:</w:t>
+      </w:r>
+      <w:r>
+        <w:rPr>
+          <w:rtl/>
+        </w:rPr>
+        <w:t xml:space="preserve"> </w:t>
+      </w:r>
+      <w:r>
+        <w:rPr>
+          <w:rtl/>
+        </w:rPr>
+        <w:t xml:space="preserve">يتقدم المالك فوراً بطلب تأجيل القرض القائم ضمن حزمة البترا قبل نهاية 2026. يدرج الإيجار المقدم في خطابات النوايا، ويسجل في منصة</w:t>
+      </w:r>
+      <w:r>
+        <w:rPr>
+          <w:rtl/>
+        </w:rPr>
+        <w:t xml:space="preserve"> </w:t>
+      </w:r>
+      <w:r>
+        <w:rPr>
+          <w:rtl/>
+        </w:rPr>
+        <w:t xml:space="preserve">“</w:t>
+      </w:r>
+      <w:r>
+        <w:rPr>
+          <w:rtl/>
+        </w:rPr>
+        <w:t xml:space="preserve">تشغيل</w:t>
+      </w:r>
+      <w:r>
+        <w:rPr>
+          <w:rtl/>
+        </w:rPr>
+        <w:t xml:space="preserve">”</w:t>
+      </w:r>
+      <w:r>
+        <w:rPr>
+          <w:rtl/>
+        </w:rPr>
+        <w:t xml:space="preserve"> </w:t>
+      </w:r>
+      <w:r>
+        <w:rPr>
+          <w:rtl/>
+        </w:rPr>
+        <w:t xml:space="preserve">قبل الافتتاح في آذار 2027. ويطلب من وزارة الاستثمار رأياً مكتوباً في الإعفاءات. يحتسب البنك فقط ما يُوقّع، وتبقى مساهمة المالك الإضافية خطة الاحتياط.</w:t>
+      </w:r>
+    </w:p>
+    <w:bookmarkEnd w:id="48"/>
+    <w:bookmarkEnd w:id="49"/>
     <w:sectPr/>
   </w:body>
 </w:document>

</xml_diff>